<commit_message>
mise à jours du 15/05/2026 à 07h45
</commit_message>
<xml_diff>
--- a/Documentation_ChimioPro_CHNCAK.docx
+++ b/Documentation_ChimioPro_CHNCAK.docx
@@ -2,6 +2,174 @@
 <file path=word/document.xml><?xml version="1.0" encoding="utf-8"?>
 <w:document xmlns:wpc="http://schemas.microsoft.com/office/word/2010/wordprocessingCanvas" xmlns:mo="http://schemas.microsoft.com/office/mac/office/2008/main" xmlns:mc="http://schemas.openxmlformats.org/markup-compatibility/2006" xmlns:mv="urn:schemas-microsoft-com:mac:vml" xmlns:o="urn:schemas-microsoft-com:office:office" xmlns:r="http://schemas.openxmlformats.org/officeDocument/2006/relationships" xmlns:m="http://schemas.openxmlformats.org/officeDocument/2006/math" xmlns:v="urn:schemas-microsoft-com:vml" xmlns:wp14="http://schemas.microsoft.com/office/word/2010/wordprocessingDrawing" xmlns:wp="http://schemas.openxmlformats.org/drawingml/2006/wordprocessingDrawing" xmlns:w10="urn:schemas-microsoft-com:office:word" xmlns:w="http://schemas.openxmlformats.org/wordprocessingml/2006/main" xmlns:w14="http://schemas.microsoft.com/office/word/2010/wordml" xmlns:wpg="http://schemas.microsoft.com/office/word/2010/wordprocessingGroup" xmlns:wpi="http://schemas.microsoft.com/office/word/2010/wordprocessingInk" xmlns:wne="http://schemas.microsoft.com/office/word/2006/wordml" xmlns:wps="http://schemas.microsoft.com/office/word/2010/wordprocessingShape" mc:Ignorable="w14 wp14">
   <w:body>
+    <w:p>
+      <w:pPr>
+        <w:pStyle w:val="CoverMeta"/>
+        <w:spacing w:before="0" w:after="80" w:line="240" w:lineRule="auto"/>
+        <w:jc w:val="center"/>
+      </w:pPr>
+      <w:r>
+        <w:rPr>
+          <w:b/>
+        </w:rPr>
+        <w:t>CENTRE HOSPITALIER NATIONAL CHEIKH AHMADOUL KHADIM</w:t>
+      </w:r>
+    </w:p>
+    <w:p>
+      <w:pPr>
+        <w:pStyle w:val="CoverMeta"/>
+        <w:spacing w:before="0" w:after="440" w:line="240" w:lineRule="auto"/>
+        <w:jc w:val="center"/>
+      </w:pPr>
+      <w:r>
+        <w:t>Service d'Oncologie-Radiotherapie - Touba</w:t>
+      </w:r>
+    </w:p>
+    <w:p>
+      <w:pPr>
+        <w:pStyle w:val="CoverTitle"/>
+        <w:spacing w:before="880" w:after="80" w:line="240" w:lineRule="auto"/>
+        <w:jc w:val="center"/>
+      </w:pPr>
+      <w:r>
+        <w:rPr>
+          <w:sz w:val="72"/>
+        </w:rPr>
+        <w:t>CHIMIOPRO</w:t>
+      </w:r>
+    </w:p>
+    <w:p>
+      <w:pPr>
+        <w:pStyle w:val="CoverSubtitle"/>
+        <w:spacing w:before="0" w:after="360" w:line="240" w:lineRule="auto"/>
+        <w:jc w:val="center"/>
+      </w:pPr>
+      <w:r>
+        <w:rPr>
+          <w:b/>
+        </w:rPr>
+        <w:t>Documentation complete du logiciel</w:t>
+      </w:r>
+    </w:p>
+    <w:tbl>
+      <w:tblPr>
+        <w:tblW w:type="auto" w:w="0"/>
+        <w:jc w:val="center"/>
+        <w:tblLook w:firstColumn="1" w:firstRow="1" w:lastColumn="0" w:lastRow="0" w:noHBand="0" w:noVBand="1" w:val="04A0"/>
+      </w:tblPr>
+      <w:tblGrid>
+        <w:gridCol w:w="9360"/>
+      </w:tblGrid>
+      <w:tr>
+        <w:tc>
+          <w:tcPr>
+            <w:tcW w:type="dxa" w:w="9360"/>
+            <w:vAlign w:val="center"/>
+            <w:shd w:fill="EEF4FD"/>
+            <w:top w:val="single" w:sz="10" w:color="0B5E3C"/>
+            <w:left w:val="single" w:sz="10" w:color="0B5E3C"/>
+            <w:bottom w:val="single" w:sz="10" w:color="0B5E3C"/>
+            <w:right w:val="single" w:sz="10" w:color="0B5E3C"/>
+          </w:tcPr>
+          <w:p>
+            <w:r/>
+          </w:p>
+          <w:p>
+            <w:pPr>
+              <w:spacing w:after="80"/>
+              <w:jc w:val="center"/>
+            </w:pPr>
+            <w:r>
+              <w:rPr>
+                <w:rFonts w:ascii="Arial" w:hAnsi="Arial"/>
+                <w:b/>
+                <w:color w:val="0A3D7A"/>
+                <w:sz w:val="26"/>
+              </w:rPr>
+              <w:t>Manuel utilisateur, procedure d'exploitation et reference technique</w:t>
+            </w:r>
+          </w:p>
+          <w:p>
+            <w:pPr>
+              <w:spacing w:after="80"/>
+              <w:jc w:val="center"/>
+            </w:pPr>
+            <w:r>
+              <w:rPr>
+                <w:rFonts w:ascii="Arial" w:hAnsi="Arial"/>
+                <w:b w:val="0"/>
+                <w:color w:val="5B6C7D"/>
+                <w:sz w:val="20"/>
+              </w:rPr>
+              <w:t>Gestion des protocoles, OK Chimio, pharmacie centrale, preparation, rendez-vous, suivi et statistiques</w:t>
+            </w:r>
+          </w:p>
+          <w:p>
+            <w:pPr>
+              <w:spacing w:after="80"/>
+              <w:jc w:val="center"/>
+            </w:pPr>
+            <w:r>
+              <w:rPr>
+                <w:rFonts w:ascii="Arial" w:hAnsi="Arial"/>
+                <w:b/>
+                <w:color w:val="0B5E3C"/>
+                <w:sz w:val="22"/>
+              </w:rPr>
+              <w:t>Version de travail - CHNCAK Touba</w:t>
+            </w:r>
+          </w:p>
+        </w:tc>
+      </w:tr>
+    </w:tbl>
+    <w:p>
+      <w:pPr>
+        <w:spacing w:before="360" w:after="0" w:line="240" w:lineRule="auto"/>
+        <w:jc w:val="center"/>
+      </w:pPr>
+    </w:p>
+    <w:p>
+      <w:pPr>
+        <w:pStyle w:val="CoverMeta"/>
+        <w:spacing w:before="240" w:after="80" w:line="240" w:lineRule="auto"/>
+        <w:jc w:val="center"/>
+      </w:pPr>
+      <w:r>
+        <w:t>Document prepare pour l'utilisation interne du service</w:t>
+      </w:r>
+    </w:p>
+    <w:p>
+      <w:pPr>
+        <w:pStyle w:val="CoverMeta"/>
+        <w:spacing w:before="0" w:after="80" w:line="240" w:lineRule="auto"/>
+        <w:jc w:val="center"/>
+      </w:pPr>
+      <w:r>
+        <w:rPr>
+          <w:b/>
+        </w:rPr>
+        <w:t>Copyright SMSG 2026 - Serigne Mor Samb Gueye</w:t>
+      </w:r>
+    </w:p>
+    <w:p>
+      <w:pPr>
+        <w:pStyle w:val="CoverMeta"/>
+        <w:spacing w:before="0" w:after="480" w:line="240" w:lineRule="auto"/>
+        <w:jc w:val="center"/>
+      </w:pPr>
+      <w:r>
+        <w:t>Toute utilisation clinique reste soumise a la validation medicale et pharmaceutique du service.</w:t>
+      </w:r>
+    </w:p>
+    <w:p>
+      <w:pPr>
+        <w:spacing w:before="0" w:after="0" w:line="240" w:lineRule="auto"/>
+        <w:jc w:val="center"/>
+      </w:pPr>
+      <w:r>
+        <w:br w:type="page"/>
+      </w:r>
+    </w:p>
     <w:p>
       <w:pPr>
         <w:jc w:val="center"/>
@@ -7416,6 +7584,204 @@
         <w:t>Procedure de sauvegarde quotidienne communiquee aux collegues.</w:t>
       </w:r>
     </w:p>
+    <w:p>
+      <w:r>
+        <w:br w:type="page"/>
+      </w:r>
+    </w:p>
+    <w:p>
+      <w:pPr>
+        <w:pStyle w:val="DocSectionTitle"/>
+        <w:spacing w:before="160" w:after="160"/>
+      </w:pPr>
+      <w:r>
+        <w:t>12. Perspectives futures du logiciel</w:t>
+      </w:r>
+    </w:p>
+    <w:p>
+      <w:pPr>
+        <w:spacing w:after="100" w:line="259" w:lineRule="auto"/>
+      </w:pPr>
+      <w:r>
+        <w:t>Les ameliorations suivantes peuvent renforcer ChimioPro lorsque le service passera d'un usage local controle a une utilisation collective plus large.</w:t>
+      </w:r>
+    </w:p>
+    <w:p>
+      <w:pPr>
+        <w:pStyle w:val="ListBullet"/>
+        <w:spacing w:after="60"/>
+      </w:pPr>
+      <w:r>
+        <w:t>Synchronisation temps reel plus avancee avec Supabase : suivi des modifications par utilisateur, journal d'audit, resolution de conflits et verrouillage des fiches en cours de modification.</w:t>
+      </w:r>
+    </w:p>
+    <w:p>
+      <w:pPr>
+        <w:pStyle w:val="ListBullet"/>
+        <w:spacing w:after="60"/>
+      </w:pPr>
+      <w:r>
+        <w:t>Comptes utilisateurs par roles : medecin, pharmacien, preparateur, infirmier, administrateur, avec permissions adaptees a chaque action sensible.</w:t>
+      </w:r>
+    </w:p>
+    <w:p>
+      <w:pPr>
+        <w:pStyle w:val="ListBullet"/>
+        <w:spacing w:after="60"/>
+      </w:pPr>
+      <w:r>
+        <w:t>Bibliotheque officielle de protocoles valides par le service, avec historique des versions et date de validation medicale.</w:t>
+      </w:r>
+    </w:p>
+    <w:p>
+      <w:pPr>
+        <w:pStyle w:val="ListBullet"/>
+        <w:spacing w:after="60"/>
+      </w:pPr>
+      <w:r>
+        <w:t>Sauvegardes automatiques planifiees, export mensuel et restauration controlee afin de limiter le risque de perte de donnees.</w:t>
+      </w:r>
+    </w:p>
+    <w:p>
+      <w:pPr>
+        <w:pStyle w:val="ListBullet"/>
+        <w:spacing w:after="60"/>
+      </w:pPr>
+      <w:r>
+        <w:t>Tableaux de bord plus analytiques : consommation par molecule, couts, reliquats, activite par periode, charge de preparation et suivi des rendez-vous.</w:t>
+      </w:r>
+    </w:p>
+    <w:p>
+      <w:pPr>
+        <w:pStyle w:val="ListBullet"/>
+        <w:spacing w:after="60"/>
+      </w:pPr>
+      <w:r>
+        <w:t>Notifications organisees : email, impression, et a terme SMS ou messagerie interne pour RDV, protocoles en attente, ruptures et alertes biologiques.</w:t>
+      </w:r>
+    </w:p>
+    <w:p>
+      <w:pPr>
+        <w:pStyle w:val="ListBullet"/>
+        <w:spacing w:after="60"/>
+      </w:pPr>
+      <w:r>
+        <w:t>Mode multi-postes plus robuste avec authentification cloud et politiques de securite RLS renforcees cote Supabase.</w:t>
+      </w:r>
+    </w:p>
+    <w:p>
+      <w:pPr>
+        <w:pStyle w:val="DocSectionTitle"/>
+        <w:spacing w:before="160" w:after="160"/>
+      </w:pPr>
+      <w:r>
+        <w:t>13. Limites d'utilisation</w:t>
+      </w:r>
+    </w:p>
+    <w:p>
+      <w:pPr>
+        <w:spacing w:after="100" w:line="259" w:lineRule="auto"/>
+      </w:pPr>
+      <w:r>
+        <w:t>ChimioPro est un outil d'aide a l'organisation, au calcul et a la tracabilite. Il ne remplace pas la responsabilite clinique du prescripteur, du pharmacien ou du personnel soignant.</w:t>
+      </w:r>
+    </w:p>
+    <w:p>
+      <w:pPr>
+        <w:pStyle w:val="ListBullet"/>
+        <w:spacing w:after="60"/>
+      </w:pPr>
+      <w:r>
+        <w:t>Les protocoles, doses, bilans utiles et ordonnances doivent etre valides par le service avant utilisation officielle.</w:t>
+      </w:r>
+    </w:p>
+    <w:p>
+      <w:pPr>
+        <w:pStyle w:val="ListBullet"/>
+        <w:spacing w:after="60"/>
+      </w:pPr>
+      <w:r>
+        <w:t>Les calculs dependent directement des donnees saisies : poids, taille, surface corporelle, creatininemie, protocole selectionne, catalogue et stock.</w:t>
+      </w:r>
+    </w:p>
+    <w:p>
+      <w:pPr>
+        <w:pStyle w:val="ListBullet"/>
+        <w:spacing w:after="60"/>
+      </w:pPr>
+      <w:r>
+        <w:t>Une erreur de saisie peut produire un calcul errone ; une verification humaine reste obligatoire avant preparation et administration.</w:t>
+      </w:r>
+    </w:p>
+    <w:p>
+      <w:pPr>
+        <w:pStyle w:val="ListBullet"/>
+        <w:spacing w:after="60"/>
+      </w:pPr>
+      <w:r>
+        <w:t>GitHub sert a publier le code de l'application. Les donnees des patients ne doivent pas etre considerees comme stockees sur GitHub.</w:t>
+      </w:r>
+    </w:p>
+    <w:p>
+      <w:pPr>
+        <w:pStyle w:val="ListBullet"/>
+        <w:spacing w:after="60"/>
+      </w:pPr>
+      <w:r>
+        <w:t>La synchronisation Supabase depend de la connexion internet, de la configuration RLS, des droits utilisateurs et des limites du forfait actif.</w:t>
+      </w:r>
+    </w:p>
+    <w:p>
+      <w:pPr>
+        <w:pStyle w:val="ListBullet"/>
+        <w:spacing w:after="60"/>
+      </w:pPr>
+      <w:r>
+        <w:t>Les emails generes par l'application utilisent le logiciel de messagerie de l'ordinateur ; l'envoi effectif doit etre verifie par l'utilisateur.</w:t>
+      </w:r>
+    </w:p>
+    <w:p>
+      <w:pPr>
+        <w:pStyle w:val="ListBullet"/>
+        <w:spacing w:after="60"/>
+      </w:pPr>
+      <w:r>
+        <w:t>Toute evolution de medicament, protocole ou support therapeutique doit etre documentee, testee puis validee avant mise en service.</w:t>
+      </w:r>
+    </w:p>
+    <w:p>
+      <w:pPr>
+        <w:pStyle w:val="DocSectionTitle"/>
+        <w:spacing w:before="160" w:after="160"/>
+      </w:pPr>
+      <w:r>
+        <w:t>14. Droits d'auteur et responsabilite</w:t>
+      </w:r>
+    </w:p>
+    <w:p>
+      <w:pPr>
+        <w:spacing w:after="100" w:line="259" w:lineRule="auto"/>
+      </w:pPr>
+      <w:r>
+        <w:t>Copyright SMSG 2026 - Serigne Mor Samb Gueye. Documentation et logiciel prepares pour le Service d'Oncologie-Radiotherapie du Centre Hospitalier National Cheikh Ahmadoul Khadim de Touba.</w:t>
+      </w:r>
+    </w:p>
+    <w:p>
+      <w:pPr>
+        <w:spacing w:after="100" w:line="259" w:lineRule="auto"/>
+      </w:pPr>
+      <w:r>
+        <w:t>Toute reproduction, diffusion, modification ou reutilisation en dehors du cadre autorise par le service doit etre validee par le responsable du projet et par l'administration concernee.</w:t>
+      </w:r>
+    </w:p>
+    <w:p>
+      <w:pPr>
+        <w:spacing w:after="100" w:line="259" w:lineRule="auto"/>
+      </w:pPr>
+      <w:r>
+        <w:t>L'application est fournie comme support operationnel. Les decisions therapeutiques, les validations de protocoles, les adaptations de dose et les administrations restent sous la responsabilite des professionnels habilites.</w:t>
+      </w:r>
+    </w:p>
     <w:sectPr>
       <w:headerReference w:type="default" r:id="rId9"/>
       <w:footerReference w:type="default" r:id="rId10"/>
@@ -7437,11 +7803,11 @@
     </w:pPr>
     <w:r>
       <w:rPr>
-        <w:rFonts w:ascii="Calibri" w:hAnsi="Calibri"/>
-        <w:color w:val="555E69"/>
-        <w:sz w:val="17"/>
-      </w:rPr>
-      <w:t>Document de travail - verifier les procedures locales avant usage clinique officiel</w:t>
+        <w:rFonts w:ascii="Arial" w:hAnsi="Arial"/>
+        <w:color w:val="5B6C7D"/>
+        <w:sz w:val="16"/>
+      </w:rPr>
+      <w:t>ChimioPro CHNCAK - Copyright SMSG 2026 - Usage interne</w:t>
     </w:r>
   </w:p>
 </w:ftr>
@@ -19520,6 +19886,40 @@
         <w:shd w:val="clear" w:color="auto" w:fill="FBCAA2" w:themeFill="accent6" w:themeFillTint="7F"/>
       </w:tcPr>
     </w:tblStylePr>
+  </w:style>
+  <w:style w:type="paragraph" w:customStyle="1" w:styleId="CoverTitle">
+    <w:name w:val="CoverTitle"/>
+    <w:rPr>
+      <w:rFonts w:ascii="Arial" w:hAnsi="Arial"/>
+      <w:b/>
+      <w:color w:val="0B5E3C"/>
+      <w:sz w:val="60"/>
+    </w:rPr>
+  </w:style>
+  <w:style w:type="paragraph" w:customStyle="1" w:styleId="CoverSubtitle">
+    <w:name w:val="CoverSubtitle"/>
+    <w:rPr>
+      <w:rFonts w:ascii="Arial" w:hAnsi="Arial"/>
+      <w:color w:val="0A3D7A"/>
+      <w:sz w:val="30"/>
+    </w:rPr>
+  </w:style>
+  <w:style w:type="paragraph" w:customStyle="1" w:styleId="CoverMeta">
+    <w:name w:val="CoverMeta"/>
+    <w:rPr>
+      <w:rFonts w:ascii="Arial" w:hAnsi="Arial"/>
+      <w:color w:val="5B6C7D"/>
+      <w:sz w:val="20"/>
+    </w:rPr>
+  </w:style>
+  <w:style w:type="paragraph" w:customStyle="1" w:styleId="DocSectionTitle">
+    <w:name w:val="DocSectionTitle"/>
+    <w:rPr>
+      <w:rFonts w:ascii="Arial" w:hAnsi="Arial"/>
+      <w:b/>
+      <w:color w:val="0B5E3C"/>
+      <w:sz w:val="32"/>
+    </w:rPr>
   </w:style>
 </w:styles>
 </file>

</xml_diff>